<commit_message>
feat(service): alerte « plus de place » par periode, texte personnalisable et e-mail de contact
Co-Authored-By: Claude Fable 5 <noreply@anthropic.com>
</commit_message>
<xml_diff>
--- a/docs/Guide-usager.docx
+++ b/docs/Guide-usager.docx
@@ -1030,6 +1030,26 @@
       </w:r>
       <w:r>
         <w:t xml:space="preserve"> — un rappel précise le nombre de séances réservables et les conditions du service (récurrent, semaines A/B, validation, thèmes, jauge, jours fériés, vacances scolaires).</w:t>
+      </w:r>
+    </w:p>
+    <w:p>
+      <w:pPr>
+        <w:pStyle w:val="ListParagraph"/>
+        <w:numPr>
+          <w:ilvl w:val="0"/>
+          <w:numId w:val="2"/>
+        </w:numPr>
+        <w:spacing w:after="80"/>
+      </w:pPr>
+      <w:r>
+        <w:rPr>
+          <w:b/>
+          <w:bCs/>
+        </w:rPr>
+        <w:t xml:space="preserve">Plus de place</w:t>
+      </w:r>
+      <w:r>
+        <w:t xml:space="preserve"> — à votre arrivée sur l'agenda ou sur une période, si plus aucun créneau de la période affichée n'est réservable (tout est complet, clos ou hors délai), un message vous en informe et vous invite à contacter le service par e-mail (si le service a activé cette alerte).</w:t>
       </w:r>
     </w:p>
     <w:p>

</xml_diff>

<commit_message>
feat(liste d attente): proposee au bon moment — creneau complet (toast cliquable, demi-journee precochee), fenetre « plus aucune place », e-mails refus / suppression ({{liste_attente}}, migration des modeles stockes)
Co-Authored-By: Claude Fable 5.1 <noreply@anthropic.com>
</commit_message>
<xml_diff>
--- a/docs/Guide-usager.docx
+++ b/docs/Guide-usager.docx
@@ -1518,7 +1518,27 @@
         <w:t xml:space="preserve">retirer de la liste</w:t>
       </w:r>
       <w:r>
-        <w:t xml:space="preserve">. Si vous avez déjà atteint votre maximum de réservations (pour l'année, ou sur chaque période), vous ne pouvez pas vous inscrire sur la liste d'attente de ce service.</w:t>
+        <w:t xml:space="preserve">. Si vous avez déjà atteint votre maximum de réservations (pour l'année, ou sur chaque période), vous ne pouvez pas vous inscrire sur la liste d'attente de ce service. La liste vous est aussi proposée au bon moment : un clic sur un créneau </w:t>
+      </w:r>
+      <w:r>
+        <w:rPr>
+          <w:b/>
+          <w:bCs/>
+        </w:rPr>
+        <w:t xml:space="preserve">complet</w:t>
+      </w:r>
+      <w:r>
+        <w:t xml:space="preserve"> affiche un lien « s'inscrire sur la liste d'attente » (la demi-journée du créneau est précochée), la fenêtre </w:t>
+      </w:r>
+      <w:r>
+        <w:rPr>
+          <w:b/>
+          <w:bCs/>
+        </w:rPr>
+        <w:t xml:space="preserve">« Plus aucune place disponible »</w:t>
+      </w:r>
+      <w:r>
+        <w:t xml:space="preserve"> porte un bouton d'inscription, et les e-mails de refus ou de suppression par le service rappellent la liste d'attente.</w:t>
       </w:r>
     </w:p>
     <w:p>

</xml_diff>